<commit_message>
Atualiza datas, trabalhos e edital conforme pedido da organização
- Simpósio passa para 03 e 04 de dezembro de 2026 (quinta e sexta-feira)
- Inscrições a partir de 25/09/2026, com vagas limitadas, sem número
- Trabalhos: envio a partir de 25/09, prazo 31/10, resultado final 16/11;
  campo Plataforma removido
- Novos eixos temáticos (cinco) no site e no edital
- Normas de submissão: tipos aceitos, limites de autoria, 2.050
  caracteres, estrutura e formatação do resumo
- Edital: datas, cronograma, programação com datas, itens 5.2 a 5.4,
  nome "1º Simpósio" e espaços vazios removidos
- Site: ajustes de espaçamento nas notas e nos eixos para celular

Co-Authored-By: Claude Opus 5.5 <noreply@anthropic.com>
Claude-Session: https://claude.ai/code/session_01XvSnyy5x4WrQRf3DuqJm68
</commit_message>
<xml_diff>
--- a/Edital.docx
+++ b/Edital.docx
@@ -25,7 +25,7 @@
           <w:szCs w:val="28"/>
           <w:rtl w:val="0"/>
         </w:rPr>
-        <w:t xml:space="preserve">EDITAL DO SIMPÓSIO DE URGÊNCIA E EMERGÊNCIA</w:t>
+        <w:t xml:space="preserve">EDITAL DO 1º SIMPÓSIO DE URGÊNCIA E EMERGÊNCIA</w:t>
       </w:r>
     </w:p>
     <w:p>
@@ -63,7 +63,7 @@
         <w:rPr>
           <w:rtl w:val="0"/>
         </w:rPr>
-        <w:t xml:space="preserve">A Secretaria Municipal de Saúde do Rio de Janeiro, por meio da Subsecretaria de Atenção Hospitalar, Urgência e Emergência – SUBHUE, realizará o Simpósio de Urgência e Emergência, nos dias 27 e 28 de novembro de 2026, com o objetivo de promover a atualização técnico-científica, a integração entre os profissionais da Rede de Urgência e Emergência e o compartilhamento de experiências e práticas voltadas à qualificação da assistência.</w:t>
+        <w:t xml:space="preserve">A Secretaria Municipal de Saúde do Rio de Janeiro, por meio da Subsecretaria de Atenção Hospitalar, Urgência e Emergência – SUBHUE, realizará o 1º Simpósio de Urgência e Emergência, nos dias 03 e 04 de dezembro de 2026, com o objetivo de promover a atualização técnico-científica, a integração entre os profissionais da Rede de Urgência e Emergência e o compartilhamento de experiências e práticas voltadas à qualificação da assistência.</w:t>
       </w:r>
     </w:p>
     <w:p>
@@ -593,41 +593,24 @@
           <w:bCs w:val="1"/>
           <w:rtl w:val="0"/>
         </w:rPr>
-        <w:t xml:space="preserve">Período de inscrições:</w:t>
-      </w:r>
-      <w:r>
-        <w:rPr>
-          <w:rtl w:val="0"/>
-        </w:rPr>
-        <w:t xml:space="preserve"> de </w:t>
-      </w:r>
-      <w:r>
+        <w:t xml:space="preserve">Início das inscrições: 25/09/2026.</w:t>
+      </w:r>
+    </w:p>
+    <w:p>
+      <w:pPr>
+        <w:spacing w:after="240" w:before="240" w:lineRule="auto"/>
         <w:rPr>
           <w:b w:val="1"/>
           <w:bCs w:val="1"/>
-          <w:rtl w:val="0"/>
-        </w:rPr>
-        <w:t xml:space="preserve">//2026</w:t>
-      </w:r>
-      <w:r>
-        <w:rPr>
-          <w:rtl w:val="0"/>
-        </w:rPr>
-        <w:t xml:space="preserve"> até </w:t>
-      </w:r>
+        </w:rPr>
+      </w:pPr>
       <w:r>
         <w:rPr>
           <w:b w:val="1"/>
           <w:bCs w:val="1"/>
           <w:rtl w:val="0"/>
         </w:rPr>
-        <w:t xml:space="preserve">//2026</w:t>
-      </w:r>
-      <w:r>
-        <w:rPr>
-          <w:rtl w:val="0"/>
-        </w:rPr>
-        <w:t xml:space="preserve">.</w:t>
+        <w:t xml:space="preserve">Vagas: limitadas.</w:t>
       </w:r>
     </w:p>
     <w:p>
@@ -716,13 +699,7 @@
         <w:rPr>
           <w:rtl w:val="0"/>
         </w:rPr>
-        <w:t xml:space="preserve">Será disponibilizado espaço para</w:t>
-      </w:r>
-      <w:r>
-        <w:rPr>
-          <w:rtl w:val="0"/>
-        </w:rPr>
-        <w:t xml:space="preserve"> submissão e apresentação de trabalhos científicos e relatos de experiências relacionados à área de Urgência e Emergência.</w:t>
+        <w:t xml:space="preserve">Será disponibilizado espaço para submissão e apresentação de trabalhos científicos relacionados à área de Urgência e Emergência. Serão aceitos Estudos Originais (estudos observacionais ou de intervenção), Relatos de Caso ou Revisões Sistemáticas. Não serão aceitos trabalhos de outras áreas do conhecimento.</w:t>
       </w:r>
     </w:p>
     <w:p>
@@ -734,7 +711,7 @@
         <w:rPr>
           <w:rtl w:val="0"/>
         </w:rPr>
-        <w:t xml:space="preserve">Poderão ser submetidos trabalhos que contemplem, entre outros, os seguintes temas:</w:t>
+        <w:t xml:space="preserve">Cada trabalho deverá ser inscrito em um dos seguintes eixos temáticos:</w:t>
       </w:r>
     </w:p>
     <w:p>
@@ -750,7 +727,7 @@
         <w:rPr>
           <w:rtl w:val="0"/>
         </w:rPr>
-        <w:t xml:space="preserve">Atendimento pré-hospitalar;</w:t>
+        <w:t xml:space="preserve">Emergências clínicas do adulto;</w:t>
       </w:r>
     </w:p>
     <w:p>
@@ -766,7 +743,7 @@
         <w:rPr>
           <w:rtl w:val="0"/>
         </w:rPr>
-        <w:t xml:space="preserve">Atendimento às urgências e emergências;</w:t>
+        <w:t xml:space="preserve">Emergências pediátricas;</w:t>
       </w:r>
     </w:p>
     <w:p>
@@ -782,7 +759,7 @@
         <w:rPr>
           <w:rtl w:val="0"/>
         </w:rPr>
-        <w:t xml:space="preserve">Trauma;</w:t>
+        <w:t xml:space="preserve">Trauma, queimaduras e emergências cirúrgicas;</w:t>
       </w:r>
     </w:p>
     <w:p>
@@ -798,7 +775,176 @@
         <w:rPr>
           <w:rtl w:val="0"/>
         </w:rPr>
-        <w:t xml:space="preserve">Acidente Vascular Cerebral – AVC;</w:t>
+        <w:t xml:space="preserve">Ressuscitação, via aérea e suporte ao paciente crítico;</w:t>
+      </w:r>
+    </w:p>
+    <w:p>
+      <w:pPr>
+        <w:numPr>
+          <w:ilvl w:val="0"/>
+          <w:numId w:val="2"/>
+        </w:numPr>
+        <w:spacing w:after="240" w:before="0" w:beforeAutospacing="0" w:lineRule="auto"/>
+        <w:ind w:left="720" w:hanging="360"/>
+      </w:pPr>
+      <w:r>
+        <w:rPr>
+          <w:rtl w:val="0"/>
+        </w:rPr>
+        <w:t xml:space="preserve">Saúde mental, intoxicações e emergências comportamentais.</w:t>
+      </w:r>
+    </w:p>
+    <w:p>
+      <w:pPr>
+        <w:pStyle w:val="Heading2"/>
+        <w:keepNext w:val="0"/>
+        <w:keepLines w:val="0"/>
+        <w:spacing w:after="80" w:lineRule="auto"/>
+        <w:rPr>
+          <w:b w:val="1"/>
+          <w:bCs w:val="1"/>
+          <w:sz w:val="28"/>
+          <w:szCs w:val="28"/>
+        </w:rPr>
+      </w:pPr>
+      <w:bookmarkStart w:colFirst="0" w:colLast="0" w:name="_6fo799qe08oa" w:id="6"/>
+      <w:bookmarkEnd w:id="6"/>
+      <w:r>
+        <w:rPr>
+          <w:b w:val="1"/>
+          <w:bCs w:val="1"/>
+          <w:sz w:val="28"/>
+          <w:szCs w:val="28"/>
+          <w:rtl w:val="0"/>
+        </w:rPr>
+        <w:t xml:space="preserve">5.1 – Envio dos trabalhos</w:t>
+      </w:r>
+    </w:p>
+    <w:p>
+      <w:pPr>
+        <w:spacing w:after="240" w:before="240" w:lineRule="auto"/>
+        <w:rPr/>
+      </w:pPr>
+      <w:r>
+        <w:rPr>
+          <w:rtl w:val="0"/>
+        </w:rPr>
+        <w:t xml:space="preserve">A submissão dos trabalhos somente será possível para inscritos no Simpósio e deverá ser realizada pelo site do evento, na área do inscrito.</w:t>
+      </w:r>
+    </w:p>
+    <w:p>
+      <w:pPr>
+        <w:spacing w:after="240" w:before="240" w:lineRule="auto"/>
+        <w:rPr>
+          <w:b w:val="1"/>
+          <w:bCs w:val="1"/>
+        </w:rPr>
+      </w:pPr>
+      <w:r>
+        <w:rPr>
+          <w:b w:val="1"/>
+          <w:bCs w:val="1"/>
+          <w:rtl w:val="0"/>
+        </w:rPr>
+        <w:t xml:space="preserve">Início do envio: 25/09/2026.</w:t>
+      </w:r>
+    </w:p>
+    <w:p>
+      <w:pPr>
+        <w:spacing w:after="240" w:before="240" w:lineRule="auto"/>
+        <w:rPr>
+          <w:b w:val="1"/>
+          <w:bCs w:val="1"/>
+        </w:rPr>
+      </w:pPr>
+      <w:r>
+        <w:rPr>
+          <w:b w:val="1"/>
+          <w:bCs w:val="1"/>
+          <w:rtl w:val="0"/>
+        </w:rPr>
+        <w:t xml:space="preserve">Data limite para envio: 31/10/2026.</w:t>
+      </w:r>
+    </w:p>
+    <w:p>
+      <w:pPr>
+        <w:spacing w:after="240" w:before="240" w:lineRule="auto"/>
+        <w:rPr>
+          <w:b w:val="1"/>
+          <w:bCs w:val="1"/>
+        </w:rPr>
+      </w:pPr>
+      <w:r>
+        <w:rPr>
+          <w:b w:val="1"/>
+          <w:bCs w:val="1"/>
+          <w:rtl w:val="0"/>
+        </w:rPr>
+        <w:t xml:space="preserve">Divulgação do resultado final: 16/11/2026.</w:t>
+      </w:r>
+    </w:p>
+    <w:p>
+      <w:pPr>
+        <w:spacing w:after="240" w:before="240" w:lineRule="auto"/>
+        <w:rPr/>
+      </w:pPr>
+      <w:r>
+        <w:rPr>
+          <w:rtl w:val="0"/>
+        </w:rPr>
+        <w:t xml:space="preserve">Não serão considerados trabalhos enviados após o prazo estabelecido.</w:t>
+      </w:r>
+    </w:p>
+    <w:p>
+      <w:pPr>
+        <w:spacing w:after="240" w:before="240" w:lineRule="auto"/>
+        <w:rPr/>
+      </w:pPr>
+      <w:r>
+        <w:rPr>
+          <w:rtl w:val="0"/>
+        </w:rPr>
+        <w:t xml:space="preserve">O trabalho deverá ser encaminhado de acordo com as regras descritas nos itens 5.2, 5.3 e 5.4 deste Edital.</w:t>
+      </w:r>
+    </w:p>
+    <w:p>
+      <w:pPr>
+        <w:pStyle w:val="Heading2"/>
+        <w:keepNext w:val="0"/>
+        <w:keepLines w:val="0"/>
+        <w:spacing w:after="80" w:lineRule="auto"/>
+        <w:rPr>
+          <w:b w:val="1"/>
+          <w:bCs w:val="1"/>
+          <w:sz w:val="28"/>
+          <w:szCs w:val="28"/>
+        </w:rPr>
+      </w:pPr>
+      <w:r>
+        <w:rPr>
+          <w:b w:val="1"/>
+          <w:bCs w:val="1"/>
+          <w:sz w:val="28"/>
+          <w:szCs w:val="28"/>
+          <w:rtl w:val="0"/>
+        </w:rPr>
+        <w:t xml:space="preserve">5.2 – Regras gerais de submissão</w:t>
+      </w:r>
+    </w:p>
+    <w:p>
+      <w:pPr>
+        <w:numPr>
+          <w:ilvl w:val="0"/>
+          <w:numId w:val="2"/>
+        </w:numPr>
+        <w:spacing w:after="0" w:afterAutospacing="0" w:before="240" w:lineRule="auto"/>
+        <w:ind w:left="720" w:hanging="360"/>
+      </w:pPr>
+      <w:r>
+        <w:rPr>
+          <w:rtl w:val="0"/>
+        </w:rPr>
+        <w:t xml:space="preserve">Cada trabalho deverá ter um apresentador inscrito no Simpósio;</w:t>
       </w:r>
     </w:p>
     <w:p>
@@ -814,7 +960,63 @@
         <w:rPr>
           <w:rtl w:val="0"/>
         </w:rPr>
-        <w:t xml:space="preserve">Infarto Agudo do Miocárdio – IAM;</w:t>
+        <w:t xml:space="preserve">Cada autor poderá submeter, como primeiro autor, no máximo 3 (três) trabalhos;</w:t>
+      </w:r>
+    </w:p>
+    <w:p>
+      <w:pPr>
+        <w:numPr>
+          <w:ilvl w:val="0"/>
+          <w:numId w:val="2"/>
+        </w:numPr>
+        <w:spacing w:after="240" w:before="0" w:beforeAutospacing="0" w:lineRule="auto"/>
+        <w:ind w:left="720" w:hanging="360"/>
+      </w:pPr>
+      <w:r>
+        <w:rPr>
+          <w:rtl w:val="0"/>
+        </w:rPr>
+        <w:t xml:space="preserve">Cada trabalho poderá ter até 10 (dez) autores e coautores.</w:t>
+      </w:r>
+    </w:p>
+    <w:p>
+      <w:pPr>
+        <w:pStyle w:val="Heading2"/>
+        <w:keepNext w:val="0"/>
+        <w:keepLines w:val="0"/>
+        <w:spacing w:after="80" w:lineRule="auto"/>
+        <w:rPr>
+          <w:b w:val="1"/>
+          <w:bCs w:val="1"/>
+          <w:sz w:val="28"/>
+          <w:szCs w:val="28"/>
+        </w:rPr>
+      </w:pPr>
+      <w:r>
+        <w:rPr>
+          <w:b w:val="1"/>
+          <w:bCs w:val="1"/>
+          <w:sz w:val="28"/>
+          <w:szCs w:val="28"/>
+          <w:rtl w:val="0"/>
+        </w:rPr>
+        <w:t xml:space="preserve">5.3 – Regras específicas do resumo</w:t>
+      </w:r>
+    </w:p>
+    <w:p>
+      <w:pPr>
+        <w:numPr>
+          <w:ilvl w:val="0"/>
+          <w:numId w:val="2"/>
+        </w:numPr>
+        <w:spacing w:after="0" w:afterAutospacing="0" w:before="240" w:lineRule="auto"/>
+        <w:ind w:left="720" w:hanging="360"/>
+      </w:pPr>
+      <w:r>
+        <w:rPr>
+          <w:rtl w:val="0"/>
+        </w:rPr>
+        <w:t xml:space="preserve">O trabalho deverá apresentar Introdução, Métodos, Resultados e Conclusões;</w:t>
       </w:r>
     </w:p>
     <w:p>
@@ -830,7 +1032,7 @@
         <w:rPr>
           <w:rtl w:val="0"/>
         </w:rPr>
-        <w:t xml:space="preserve">Sepse;</w:t>
+        <w:t xml:space="preserve">O resumo deverá conter no máximo 2.050 caracteres, sem contar os espaços. O título e os nomes dos autores não entram na contagem de caracteres;</w:t>
       </w:r>
     </w:p>
     <w:p>
@@ -846,7 +1048,7 @@
         <w:rPr>
           <w:rtl w:val="0"/>
         </w:rPr>
-        <w:t xml:space="preserve">Parada cardiorrespiratória e reanimação cardiopulmonar;</w:t>
+        <w:t xml:space="preserve">O texto deverá ser objetivo e claro;</w:t>
       </w:r>
     </w:p>
     <w:p>
@@ -862,7 +1064,7 @@
         <w:rPr>
           <w:rtl w:val="0"/>
         </w:rPr>
-        <w:t xml:space="preserve">Classificação de risco;</w:t>
+        <w:t xml:space="preserve">Não serão aceitos trabalhos do tipo “resultados serão apresentados futuramente” nem com informações incompletas;</w:t>
       </w:r>
     </w:p>
     <w:p>
@@ -878,7 +1080,7 @@
         <w:rPr>
           <w:rtl w:val="0"/>
         </w:rPr>
-        <w:t xml:space="preserve">Gestão dos serviços de urgência e emergência;</w:t>
+        <w:t xml:space="preserve">Não usar negrito, itálico, fontes diferenciadas ou ilustrações;</w:t>
       </w:r>
     </w:p>
     <w:p>
@@ -894,7 +1096,7 @@
         <w:rPr>
           <w:rtl w:val="0"/>
         </w:rPr>
-        <w:t xml:space="preserve">Segurança do paciente;</w:t>
+        <w:t xml:space="preserve">Não incluir imagens, gráficos ou listas com marcadores no texto do resumo;</w:t>
       </w:r>
     </w:p>
     <w:p>
@@ -910,135 +1112,7 @@
         <w:rPr>
           <w:rtl w:val="0"/>
         </w:rPr>
-        <w:t xml:space="preserve">Educação permanente em saúde;</w:t>
-      </w:r>
-    </w:p>
-    <w:p>
-      <w:pPr>
-        <w:numPr>
-          <w:ilvl w:val="0"/>
-          <w:numId w:val="2"/>
-        </w:numPr>
-        <w:spacing w:after="0" w:afterAutospacing="0" w:before="0" w:beforeAutospacing="0" w:lineRule="auto"/>
-        <w:ind w:left="720" w:hanging="360"/>
-      </w:pPr>
-      <w:r>
-        <w:rPr>
-          <w:rtl w:val="0"/>
-        </w:rPr>
-        <w:t xml:space="preserve">Regulação e acesso aos serviços de saúde;</w:t>
-      </w:r>
-    </w:p>
-    <w:p>
-      <w:pPr>
-        <w:numPr>
-          <w:ilvl w:val="0"/>
-          <w:numId w:val="2"/>
-        </w:numPr>
-        <w:spacing w:after="0" w:afterAutospacing="0" w:before="0" w:beforeAutospacing="0" w:lineRule="auto"/>
-        <w:ind w:left="720" w:hanging="360"/>
-      </w:pPr>
-      <w:r>
-        <w:rPr>
-          <w:rtl w:val="0"/>
-        </w:rPr>
-        <w:t xml:space="preserve">Gestão de leitos;</w:t>
-      </w:r>
-    </w:p>
-    <w:p>
-      <w:pPr>
-        <w:numPr>
-          <w:ilvl w:val="0"/>
-          <w:numId w:val="2"/>
-        </w:numPr>
-        <w:spacing w:after="0" w:afterAutospacing="0" w:before="0" w:beforeAutospacing="0" w:lineRule="auto"/>
-        <w:ind w:left="720" w:hanging="360"/>
-      </w:pPr>
-      <w:r>
-        <w:rPr>
-          <w:rtl w:val="0"/>
-        </w:rPr>
-        <w:t xml:space="preserve">Tecnologia e inovação em saúde;</w:t>
-      </w:r>
-    </w:p>
-    <w:p>
-      <w:pPr>
-        <w:numPr>
-          <w:ilvl w:val="0"/>
-          <w:numId w:val="2"/>
-        </w:numPr>
-        <w:spacing w:after="0" w:afterAutospacing="0" w:before="0" w:beforeAutospacing="0" w:lineRule="auto"/>
-        <w:ind w:left="720" w:hanging="360"/>
-      </w:pPr>
-      <w:r>
-        <w:rPr>
-          <w:rtl w:val="0"/>
-        </w:rPr>
-        <w:t xml:space="preserve">Humanização da assistência;</w:t>
-      </w:r>
-    </w:p>
-    <w:p>
-      <w:pPr>
-        <w:numPr>
-          <w:ilvl w:val="0"/>
-          <w:numId w:val="2"/>
-        </w:numPr>
-        <w:spacing w:after="0" w:afterAutospacing="0" w:before="0" w:beforeAutospacing="0" w:lineRule="auto"/>
-        <w:ind w:left="720" w:hanging="360"/>
-      </w:pPr>
-      <w:r>
-        <w:rPr>
-          <w:rtl w:val="0"/>
-        </w:rPr>
-        <w:t xml:space="preserve">Enfermagem em urgência e emergência;</w:t>
-      </w:r>
-    </w:p>
-    <w:p>
-      <w:pPr>
-        <w:numPr>
-          <w:ilvl w:val="0"/>
-          <w:numId w:val="2"/>
-        </w:numPr>
-        <w:spacing w:after="0" w:afterAutospacing="0" w:before="0" w:beforeAutospacing="0" w:lineRule="auto"/>
-        <w:ind w:left="720" w:hanging="360"/>
-      </w:pPr>
-      <w:r>
-        <w:rPr>
-          <w:rtl w:val="0"/>
-        </w:rPr>
-        <w:t xml:space="preserve">Práticas multiprofissionais;</w:t>
-      </w:r>
-    </w:p>
-    <w:p>
-      <w:pPr>
-        <w:numPr>
-          <w:ilvl w:val="0"/>
-          <w:numId w:val="2"/>
-        </w:numPr>
-        <w:spacing w:after="0" w:afterAutospacing="0" w:before="0" w:beforeAutospacing="0" w:lineRule="auto"/>
-        <w:ind w:left="720" w:hanging="360"/>
-      </w:pPr>
-      <w:r>
-        <w:rPr>
-          <w:rtl w:val="0"/>
-        </w:rPr>
-        <w:t xml:space="preserve">Organização da Rede de Urgência e Emergência;</w:t>
-      </w:r>
-    </w:p>
-    <w:p>
-      <w:pPr>
-        <w:numPr>
-          <w:ilvl w:val="0"/>
-          <w:numId w:val="2"/>
-        </w:numPr>
-        <w:spacing w:after="0" w:afterAutospacing="0" w:before="0" w:beforeAutospacing="0" w:lineRule="auto"/>
-        <w:ind w:left="720" w:hanging="360"/>
-      </w:pPr>
-      <w:r>
-        <w:rPr>
-          <w:rtl w:val="0"/>
-        </w:rPr>
-        <w:t xml:space="preserve">Experiências exitosas e boas práticas;</w:t>
+        <w:t xml:space="preserve">Não inserir referências, rodapés, tabulações ou formatações especiais, como texto justificado ou hifenização;</w:t>
       </w:r>
     </w:p>
     <w:p>
@@ -1054,7 +1128,7 @@
         <w:rPr>
           <w:rtl w:val="0"/>
         </w:rPr>
-        <w:t xml:space="preserve">Outros temas relacionados à assistência, gestão, ensino e pesquisa em urgência e emergência.</w:t>
+        <w:t xml:space="preserve">Não utilizar abreviações sem antes apresentá-las por extenso na primeira menção.</w:t>
       </w:r>
     </w:p>
     <w:p>
@@ -1070,8 +1144,6 @@
           <w:szCs w:val="28"/>
         </w:rPr>
       </w:pPr>
-      <w:bookmarkStart w:colFirst="0" w:colLast="0" w:name="_6fo799qe08oa" w:id="6"/>
-      <w:bookmarkEnd w:id="6"/>
       <w:r>
         <w:rPr>
           <w:b w:val="1"/>
@@ -1080,7 +1152,7 @@
           <w:szCs w:val="28"/>
           <w:rtl w:val="0"/>
         </w:rPr>
-        <w:t xml:space="preserve">5.1 – Envio dos trabalhos</w:t>
+        <w:t xml:space="preserve">5.4 – Conteúdo recomendado</w:t>
       </w:r>
     </w:p>
     <w:p>
@@ -1090,18 +1162,23 @@
       </w:pPr>
       <w:r>
         <w:rPr>
-          <w:rtl w:val="0"/>
-        </w:rPr>
-        <w:t xml:space="preserve">Os trabalhos deverão ser submetidos exclusivamente por meio da plataforma:</w:t>
-      </w:r>
-    </w:p>
-    <w:p>
-      <w:pPr>
-        <w:spacing w:after="240" w:before="240" w:lineRule="auto"/>
-        <w:rPr>
           <w:b w:val="1"/>
           <w:bCs w:val="1"/>
-        </w:rPr>
+          <w:rtl w:val="0"/>
+        </w:rPr>
+        <w:t xml:space="preserve">Introdução: </w:t>
+      </w:r>
+      <w:r>
+        <w:rPr>
+          <w:rtl w:val="0"/>
+        </w:rPr>
+        <w:t xml:space="preserve">apresentar o tema de forma envolvente e, se possível, incluir breve revisão do que já se sabe, lacunas na literatura e objetivo ou hipótese do estudo.</w:t>
+      </w:r>
+    </w:p>
+    <w:p>
+      <w:pPr>
+        <w:spacing w:after="240" w:before="240" w:lineRule="auto"/>
+        <w:rPr/>
       </w:pPr>
       <w:r>
         <w:rPr>
@@ -1109,16 +1186,39 @@
           <w:bCs w:val="1"/>
           <w:rtl w:val="0"/>
         </w:rPr>
-        <w:t xml:space="preserve">Plataforma para submissão: ______________________________________________</w:t>
+        <w:t xml:space="preserve">Métodos: </w:t>
+      </w:r>
+      <w:r>
+        <w:rPr>
+          <w:rtl w:val="0"/>
+        </w:rPr>
+        <w:t xml:space="preserve">descrever o delineamento do estudo, local de realização, número de participantes, critérios de inclusão e exclusão, intervenções (se houver) e métodos estatísticos.</w:t>
       </w:r>
     </w:p>
     <w:p>
       <w:pPr>
         <w:spacing w:after="240" w:before="240" w:lineRule="auto"/>
+        <w:rPr/>
+      </w:pPr>
+      <w:r>
         <w:rPr>
           <w:b w:val="1"/>
           <w:bCs w:val="1"/>
-        </w:rPr>
+          <w:rtl w:val="0"/>
+        </w:rPr>
+        <w:t xml:space="preserve">Resultados: </w:t>
+      </w:r>
+      <w:r>
+        <w:rPr>
+          <w:rtl w:val="0"/>
+        </w:rPr>
+        <w:t xml:space="preserve">iniciar detalhando os sujeitos do estudo, incluindo critérios de inclusão e exclusão, e eventuais razões de perdas. Mencionar medidas numéricas com desvios-padrão ou intervalos de confiança (IC 95%) e informar a significância estatística ou o poder do estudo, quando pertinente.</w:t>
+      </w:r>
+    </w:p>
+    <w:p>
+      <w:pPr>
+        <w:spacing w:after="240" w:before="240" w:lineRule="auto"/>
+        <w:rPr/>
       </w:pPr>
       <w:r>
         <w:rPr>
@@ -1126,31 +1226,13 @@
           <w:bCs w:val="1"/>
           <w:rtl w:val="0"/>
         </w:rPr>
-        <w:t xml:space="preserve">Data limite para envio: //2026.</w:t>
-      </w:r>
-    </w:p>
-    <w:p>
-      <w:pPr>
-        <w:spacing w:after="240" w:before="240" w:lineRule="auto"/>
-        <w:rPr/>
-      </w:pPr>
-      <w:r>
-        <w:rPr>
-          <w:rtl w:val="0"/>
-        </w:rPr>
-        <w:t xml:space="preserve">Não serão considerados trabalhos enviados após o prazo estabelecido.</w:t>
-      </w:r>
-    </w:p>
-    <w:p>
-      <w:pPr>
-        <w:spacing w:after="240" w:before="240" w:lineRule="auto"/>
-        <w:rPr/>
-      </w:pPr>
-      <w:r>
-        <w:rPr>
-          <w:rtl w:val="0"/>
-        </w:rPr>
-        <w:t xml:space="preserve">O trabalho deverá ser encaminhado de acordo com as normas e orientações disponibilizadas pela Comissão Organizadora, observando os critérios de formatação e identificação estabelecidos.</w:t>
+        <w:t xml:space="preserve">Conclusões: </w:t>
+      </w:r>
+      <w:r>
+        <w:rPr>
+          <w:rtl w:val="0"/>
+        </w:rPr>
+        <w:t xml:space="preserve">apontar as implicações dos achados, sem apresentar opiniões pessoais que não estejam sustentadas por dados. Se houver espaço, discutir as limitações do estudo e a possibilidade de generalização dos resultados.</w:t>
       </w:r>
     </w:p>
     <w:p>
@@ -1327,7 +1409,7 @@
         <w:rPr>
           <w:rtl w:val="0"/>
         </w:rPr>
-        <w:t xml:space="preserve">Aplicabilidade dos resultados ou experiência apresentada.</w:t>
+        <w:t xml:space="preserve">Aplicabilidade dos resultados apresentados.</w:t>
       </w:r>
     </w:p>
     <w:p>
@@ -1351,7 +1433,7 @@
         <w:rPr>
           <w:rtl w:val="0"/>
         </w:rPr>
-        <w:t xml:space="preserve">O resultado da avaliação será divulgado aos autores por meio do canal informado pela organização do evento.</w:t>
+        <w:t xml:space="preserve">O resultado final da avaliação será divulgado aos autores em 16/11/2026, por meio do canal informado pela organização do evento.</w:t>
       </w:r>
     </w:p>
     <w:p>
@@ -1613,56 +1695,6 @@
           <w:rtl w:val="0"/>
         </w:rPr>
         <w:t xml:space="preserve">IX – DO CRONOGRAMA</w:t>
-      </w:r>
-    </w:p>
-    <w:p>
-      <w:pPr>
-        <w:rPr/>
-      </w:pPr>
-      <w:r>
-        <w:rPr>
-          <w:rtl w:val="0"/>
-        </w:rPr>
-      </w:r>
-    </w:p>
-    <w:p>
-      <w:pPr>
-        <w:rPr/>
-      </w:pPr>
-      <w:r>
-        <w:rPr>
-          <w:rtl w:val="0"/>
-        </w:rPr>
-      </w:r>
-    </w:p>
-    <w:p>
-      <w:pPr>
-        <w:rPr/>
-      </w:pPr>
-      <w:r>
-        <w:rPr>
-          <w:rtl w:val="0"/>
-        </w:rPr>
-      </w:r>
-    </w:p>
-    <w:p>
-      <w:pPr>
-        <w:rPr/>
-      </w:pPr>
-      <w:r>
-        <w:rPr>
-          <w:rtl w:val="0"/>
-        </w:rPr>
-      </w:r>
-    </w:p>
-    <w:p>
-      <w:pPr>
-        <w:rPr/>
-      </w:pPr>
-      <w:r>
-        <w:rPr>
-          <w:rtl w:val="0"/>
-        </w:rPr>
       </w:r>
     </w:p>
     <w:tbl>
@@ -1828,7 +1860,7 @@
               <w:rPr>
                 <w:rtl w:val="0"/>
               </w:rPr>
-              <w:t xml:space="preserve">__________________</w:t>
+              <w:t xml:space="preserve">A divulgar</w:t>
             </w:r>
           </w:p>
         </w:tc>
@@ -1891,7 +1923,7 @@
               <w:rPr>
                 <w:rtl w:val="0"/>
               </w:rPr>
-              <w:t xml:space="preserve">__________________</w:t>
+              <w:t xml:space="preserve">25/09/2026</w:t>
             </w:r>
           </w:p>
         </w:tc>
@@ -1954,7 +1986,7 @@
               <w:rPr>
                 <w:rtl w:val="0"/>
               </w:rPr>
-              <w:t xml:space="preserve">__________________</w:t>
+              <w:t xml:space="preserve">25/09/2026</w:t>
             </w:r>
           </w:p>
         </w:tc>
@@ -2017,7 +2049,7 @@
               <w:rPr>
                 <w:rtl w:val="0"/>
               </w:rPr>
-              <w:t xml:space="preserve">__________________</w:t>
+              <w:t xml:space="preserve">A divulgar</w:t>
             </w:r>
           </w:p>
         </w:tc>
@@ -2080,7 +2112,7 @@
               <w:rPr>
                 <w:rtl w:val="0"/>
               </w:rPr>
-              <w:t xml:space="preserve">__________________</w:t>
+              <w:t xml:space="preserve">31/10/2026</w:t>
             </w:r>
           </w:p>
         </w:tc>
@@ -2143,7 +2175,7 @@
               <w:rPr>
                 <w:rtl w:val="0"/>
               </w:rPr>
-              <w:t xml:space="preserve">__________________</w:t>
+              <w:t xml:space="preserve">A divulgar</w:t>
             </w:r>
           </w:p>
         </w:tc>
@@ -2178,35 +2210,35 @@
               <w:rPr>
                 <w:rtl w:val="0"/>
               </w:rPr>
-              <w:t xml:space="preserve">Divulgação dos trabalhos aprovados</w:t>
-            </w:r>
-          </w:p>
-        </w:tc>
-        <w:tc>
-          <w:tcPr>
-            <w:tcBorders>
-              <w:top w:color="000000" w:space="0" w:sz="0" w:val="nil"/>
-              <w:left w:color="000000" w:space="0" w:sz="0" w:val="nil"/>
-              <w:bottom w:color="000000" w:space="0" w:sz="0" w:val="nil"/>
-              <w:right w:color="000000" w:space="0" w:sz="0" w:val="nil"/>
-            </w:tcBorders>
-            <w:tcMar>
-              <w:top w:w="100.0" w:type="dxa"/>
-              <w:left w:w="100.0" w:type="dxa"/>
-              <w:bottom w:w="100.0" w:type="dxa"/>
-              <w:right w:w="100.0" w:type="dxa"/>
-            </w:tcMar>
-            <w:vAlign w:val="top"/>
-          </w:tcPr>
-          <w:p>
-            <w:pPr>
-              <w:rPr/>
-            </w:pPr>
-            <w:r>
-              <w:rPr>
-                <w:rtl w:val="0"/>
-              </w:rPr>
-              <w:t xml:space="preserve">__________________</w:t>
+              <w:t xml:space="preserve">Divulgação do resultado final dos trabalhos</w:t>
+            </w:r>
+          </w:p>
+        </w:tc>
+        <w:tc>
+          <w:tcPr>
+            <w:tcBorders>
+              <w:top w:color="000000" w:space="0" w:sz="0" w:val="nil"/>
+              <w:left w:color="000000" w:space="0" w:sz="0" w:val="nil"/>
+              <w:bottom w:color="000000" w:space="0" w:sz="0" w:val="nil"/>
+              <w:right w:color="000000" w:space="0" w:sz="0" w:val="nil"/>
+            </w:tcBorders>
+            <w:tcMar>
+              <w:top w:w="100.0" w:type="dxa"/>
+              <w:left w:w="100.0" w:type="dxa"/>
+              <w:bottom w:w="100.0" w:type="dxa"/>
+              <w:right w:w="100.0" w:type="dxa"/>
+            </w:tcMar>
+            <w:vAlign w:val="top"/>
+          </w:tcPr>
+          <w:p>
+            <w:pPr>
+              <w:rPr/>
+            </w:pPr>
+            <w:r>
+              <w:rPr>
+                <w:rtl w:val="0"/>
+              </w:rPr>
+              <w:t xml:space="preserve">16/11/2026</w:t>
             </w:r>
           </w:p>
         </w:tc>
@@ -2269,7 +2301,7 @@
               <w:rPr>
                 <w:rtl w:val="0"/>
               </w:rPr>
-              <w:t xml:space="preserve">__________________</w:t>
+              <w:t xml:space="preserve">A divulgar</w:t>
             </w:r>
           </w:p>
         </w:tc>
@@ -2334,12 +2366,7 @@
                 <w:bCs w:val="1"/>
                 <w:rtl w:val="0"/>
               </w:rPr>
-              <w:t xml:space="preserve">27/11/2026</w:t>
-            </w:r>
-            <w:r>
-              <w:rPr>
-                <w:rtl w:val="0"/>
-              </w:rPr>
+              <w:t xml:space="preserve">03/12/2026</w:t>
             </w:r>
           </w:p>
         </w:tc>
@@ -2404,12 +2431,7 @@
                 <w:bCs w:val="1"/>
                 <w:rtl w:val="0"/>
               </w:rPr>
-              <w:t xml:space="preserve">28/11/2026</w:t>
-            </w:r>
-            <w:r>
-              <w:rPr>
-                <w:rtl w:val="0"/>
-              </w:rPr>
+              <w:t xml:space="preserve">04/12/2026</w:t>
             </w:r>
           </w:p>
         </w:tc>
@@ -2472,7 +2494,7 @@
               <w:rPr>
                 <w:rtl w:val="0"/>
               </w:rPr>
-              <w:t xml:space="preserve">__________________</w:t>
+              <w:t xml:space="preserve">03 e 04/12/2026</w:t>
             </w:r>
           </w:p>
         </w:tc>
@@ -2535,7 +2557,7 @@
               <w:rPr>
                 <w:rtl w:val="0"/>
               </w:rPr>
-              <w:t xml:space="preserve">__________________</w:t>
+              <w:t xml:space="preserve">A divulgar</w:t>
             </w:r>
           </w:p>
         </w:tc>
@@ -2592,6 +2614,18 @@
           <w:rtl w:val="0"/>
         </w:rPr>
         <w:t xml:space="preserve">A programação será composta por palestras, mesas-redondas, apresentações, debates e atividades técnico-científicas relacionadas à Urgência e Emergência.</w:t>
+      </w:r>
+    </w:p>
+    <w:p>
+      <w:pPr>
+        <w:spacing w:after="240" w:before="240" w:lineRule="auto"/>
+        <w:rPr/>
+      </w:pPr>
+      <w:r>
+        <w:rPr>
+          <w:rtl w:val="0"/>
+        </w:rPr>
+        <w:t xml:space="preserve">O Simpósio será realizado nos dias 03 e 04 de dezembro de 2026. Os horários e os nomes dos palestrantes serão confirmados na divulgação da programação final.</w:t>
       </w:r>
     </w:p>
     <w:tbl>
@@ -2795,35 +2829,35 @@
               <w:rPr>
                 <w:rtl w:val="0"/>
               </w:rPr>
-              <w:t xml:space="preserve">__________</w:t>
-            </w:r>
-          </w:p>
-        </w:tc>
-        <w:tc>
-          <w:tcPr>
-            <w:tcBorders>
-              <w:top w:color="000000" w:space="0" w:sz="0" w:val="nil"/>
-              <w:left w:color="000000" w:space="0" w:sz="0" w:val="nil"/>
-              <w:bottom w:color="000000" w:space="0" w:sz="0" w:val="nil"/>
-              <w:right w:color="000000" w:space="0" w:sz="0" w:val="nil"/>
-            </w:tcBorders>
-            <w:tcMar>
-              <w:top w:w="100.0" w:type="dxa"/>
-              <w:left w:w="100.0" w:type="dxa"/>
-              <w:bottom w:w="100.0" w:type="dxa"/>
-              <w:right w:w="100.0" w:type="dxa"/>
-            </w:tcMar>
-            <w:vAlign w:val="top"/>
-          </w:tcPr>
-          <w:p>
-            <w:pPr>
-              <w:rPr/>
-            </w:pPr>
-            <w:r>
-              <w:rPr>
-                <w:rtl w:val="0"/>
-              </w:rPr>
-              <w:t xml:space="preserve">__________</w:t>
+              <w:t xml:space="preserve">03/12/2026</w:t>
+            </w:r>
+          </w:p>
+        </w:tc>
+        <w:tc>
+          <w:tcPr>
+            <w:tcBorders>
+              <w:top w:color="000000" w:space="0" w:sz="0" w:val="nil"/>
+              <w:left w:color="000000" w:space="0" w:sz="0" w:val="nil"/>
+              <w:bottom w:color="000000" w:space="0" w:sz="0" w:val="nil"/>
+              <w:right w:color="000000" w:space="0" w:sz="0" w:val="nil"/>
+            </w:tcBorders>
+            <w:tcMar>
+              <w:top w:w="100.0" w:type="dxa"/>
+              <w:left w:w="100.0" w:type="dxa"/>
+              <w:bottom w:w="100.0" w:type="dxa"/>
+              <w:right w:w="100.0" w:type="dxa"/>
+            </w:tcMar>
+            <w:vAlign w:val="top"/>
+          </w:tcPr>
+          <w:p>
+            <w:pPr>
+              <w:rPr/>
+            </w:pPr>
+            <w:r>
+              <w:rPr>
+                <w:rtl w:val="0"/>
+              </w:rPr>
+              <w:t xml:space="preserve">A confirmar</w:t>
             </w:r>
           </w:p>
         </w:tc>
@@ -2886,35 +2920,35 @@
               <w:rPr>
                 <w:rtl w:val="0"/>
               </w:rPr>
-              <w:t xml:space="preserve">__________</w:t>
-            </w:r>
-          </w:p>
-        </w:tc>
-        <w:tc>
-          <w:tcPr>
-            <w:tcBorders>
-              <w:top w:color="000000" w:space="0" w:sz="0" w:val="nil"/>
-              <w:left w:color="000000" w:space="0" w:sz="0" w:val="nil"/>
-              <w:bottom w:color="000000" w:space="0" w:sz="0" w:val="nil"/>
-              <w:right w:color="000000" w:space="0" w:sz="0" w:val="nil"/>
-            </w:tcBorders>
-            <w:tcMar>
-              <w:top w:w="100.0" w:type="dxa"/>
-              <w:left w:w="100.0" w:type="dxa"/>
-              <w:bottom w:w="100.0" w:type="dxa"/>
-              <w:right w:w="100.0" w:type="dxa"/>
-            </w:tcMar>
-            <w:vAlign w:val="top"/>
-          </w:tcPr>
-          <w:p>
-            <w:pPr>
-              <w:rPr/>
-            </w:pPr>
-            <w:r>
-              <w:rPr>
-                <w:rtl w:val="0"/>
-              </w:rPr>
-              <w:t xml:space="preserve">__________</w:t>
+              <w:t xml:space="preserve">03/12/2026</w:t>
+            </w:r>
+          </w:p>
+        </w:tc>
+        <w:tc>
+          <w:tcPr>
+            <w:tcBorders>
+              <w:top w:color="000000" w:space="0" w:sz="0" w:val="nil"/>
+              <w:left w:color="000000" w:space="0" w:sz="0" w:val="nil"/>
+              <w:bottom w:color="000000" w:space="0" w:sz="0" w:val="nil"/>
+              <w:right w:color="000000" w:space="0" w:sz="0" w:val="nil"/>
+            </w:tcBorders>
+            <w:tcMar>
+              <w:top w:w="100.0" w:type="dxa"/>
+              <w:left w:w="100.0" w:type="dxa"/>
+              <w:bottom w:w="100.0" w:type="dxa"/>
+              <w:right w:w="100.0" w:type="dxa"/>
+            </w:tcMar>
+            <w:vAlign w:val="top"/>
+          </w:tcPr>
+          <w:p>
+            <w:pPr>
+              <w:rPr/>
+            </w:pPr>
+            <w:r>
+              <w:rPr>
+                <w:rtl w:val="0"/>
+              </w:rPr>
+              <w:t xml:space="preserve">A confirmar</w:t>
             </w:r>
           </w:p>
         </w:tc>
@@ -2977,35 +3011,35 @@
               <w:rPr>
                 <w:rtl w:val="0"/>
               </w:rPr>
-              <w:t xml:space="preserve">__________</w:t>
-            </w:r>
-          </w:p>
-        </w:tc>
-        <w:tc>
-          <w:tcPr>
-            <w:tcBorders>
-              <w:top w:color="000000" w:space="0" w:sz="0" w:val="nil"/>
-              <w:left w:color="000000" w:space="0" w:sz="0" w:val="nil"/>
-              <w:bottom w:color="000000" w:space="0" w:sz="0" w:val="nil"/>
-              <w:right w:color="000000" w:space="0" w:sz="0" w:val="nil"/>
-            </w:tcBorders>
-            <w:tcMar>
-              <w:top w:w="100.0" w:type="dxa"/>
-              <w:left w:w="100.0" w:type="dxa"/>
-              <w:bottom w:w="100.0" w:type="dxa"/>
-              <w:right w:w="100.0" w:type="dxa"/>
-            </w:tcMar>
-            <w:vAlign w:val="top"/>
-          </w:tcPr>
-          <w:p>
-            <w:pPr>
-              <w:rPr/>
-            </w:pPr>
-            <w:r>
-              <w:rPr>
-                <w:rtl w:val="0"/>
-              </w:rPr>
-              <w:t xml:space="preserve">__________</w:t>
+              <w:t xml:space="preserve">03/12/2026</w:t>
+            </w:r>
+          </w:p>
+        </w:tc>
+        <w:tc>
+          <w:tcPr>
+            <w:tcBorders>
+              <w:top w:color="000000" w:space="0" w:sz="0" w:val="nil"/>
+              <w:left w:color="000000" w:space="0" w:sz="0" w:val="nil"/>
+              <w:bottom w:color="000000" w:space="0" w:sz="0" w:val="nil"/>
+              <w:right w:color="000000" w:space="0" w:sz="0" w:val="nil"/>
+            </w:tcBorders>
+            <w:tcMar>
+              <w:top w:w="100.0" w:type="dxa"/>
+              <w:left w:w="100.0" w:type="dxa"/>
+              <w:bottom w:w="100.0" w:type="dxa"/>
+              <w:right w:w="100.0" w:type="dxa"/>
+            </w:tcMar>
+            <w:vAlign w:val="top"/>
+          </w:tcPr>
+          <w:p>
+            <w:pPr>
+              <w:rPr/>
+            </w:pPr>
+            <w:r>
+              <w:rPr>
+                <w:rtl w:val="0"/>
+              </w:rPr>
+              <w:t xml:space="preserve">A confirmar</w:t>
             </w:r>
           </w:p>
         </w:tc>
@@ -3068,35 +3102,35 @@
               <w:rPr>
                 <w:rtl w:val="0"/>
               </w:rPr>
-              <w:t xml:space="preserve">__________</w:t>
-            </w:r>
-          </w:p>
-        </w:tc>
-        <w:tc>
-          <w:tcPr>
-            <w:tcBorders>
-              <w:top w:color="000000" w:space="0" w:sz="0" w:val="nil"/>
-              <w:left w:color="000000" w:space="0" w:sz="0" w:val="nil"/>
-              <w:bottom w:color="000000" w:space="0" w:sz="0" w:val="nil"/>
-              <w:right w:color="000000" w:space="0" w:sz="0" w:val="nil"/>
-            </w:tcBorders>
-            <w:tcMar>
-              <w:top w:w="100.0" w:type="dxa"/>
-              <w:left w:w="100.0" w:type="dxa"/>
-              <w:bottom w:w="100.0" w:type="dxa"/>
-              <w:right w:w="100.0" w:type="dxa"/>
-            </w:tcMar>
-            <w:vAlign w:val="top"/>
-          </w:tcPr>
-          <w:p>
-            <w:pPr>
-              <w:rPr/>
-            </w:pPr>
-            <w:r>
-              <w:rPr>
-                <w:rtl w:val="0"/>
-              </w:rPr>
-              <w:t xml:space="preserve">__________</w:t>
+              <w:t xml:space="preserve">03/12/2026</w:t>
+            </w:r>
+          </w:p>
+        </w:tc>
+        <w:tc>
+          <w:tcPr>
+            <w:tcBorders>
+              <w:top w:color="000000" w:space="0" w:sz="0" w:val="nil"/>
+              <w:left w:color="000000" w:space="0" w:sz="0" w:val="nil"/>
+              <w:bottom w:color="000000" w:space="0" w:sz="0" w:val="nil"/>
+              <w:right w:color="000000" w:space="0" w:sz="0" w:val="nil"/>
+            </w:tcBorders>
+            <w:tcMar>
+              <w:top w:w="100.0" w:type="dxa"/>
+              <w:left w:w="100.0" w:type="dxa"/>
+              <w:bottom w:w="100.0" w:type="dxa"/>
+              <w:right w:w="100.0" w:type="dxa"/>
+            </w:tcMar>
+            <w:vAlign w:val="top"/>
+          </w:tcPr>
+          <w:p>
+            <w:pPr>
+              <w:rPr/>
+            </w:pPr>
+            <w:r>
+              <w:rPr>
+                <w:rtl w:val="0"/>
+              </w:rPr>
+              <w:t xml:space="preserve">A confirmar</w:t>
             </w:r>
           </w:p>
         </w:tc>
@@ -3159,35 +3193,35 @@
               <w:rPr>
                 <w:rtl w:val="0"/>
               </w:rPr>
-              <w:t xml:space="preserve">__________</w:t>
-            </w:r>
-          </w:p>
-        </w:tc>
-        <w:tc>
-          <w:tcPr>
-            <w:tcBorders>
-              <w:top w:color="000000" w:space="0" w:sz="0" w:val="nil"/>
-              <w:left w:color="000000" w:space="0" w:sz="0" w:val="nil"/>
-              <w:bottom w:color="000000" w:space="0" w:sz="0" w:val="nil"/>
-              <w:right w:color="000000" w:space="0" w:sz="0" w:val="nil"/>
-            </w:tcBorders>
-            <w:tcMar>
-              <w:top w:w="100.0" w:type="dxa"/>
-              <w:left w:w="100.0" w:type="dxa"/>
-              <w:bottom w:w="100.0" w:type="dxa"/>
-              <w:right w:w="100.0" w:type="dxa"/>
-            </w:tcMar>
-            <w:vAlign w:val="top"/>
-          </w:tcPr>
-          <w:p>
-            <w:pPr>
-              <w:rPr/>
-            </w:pPr>
-            <w:r>
-              <w:rPr>
-                <w:rtl w:val="0"/>
-              </w:rPr>
-              <w:t xml:space="preserve">__________</w:t>
+              <w:t xml:space="preserve">03/12/2026</w:t>
+            </w:r>
+          </w:p>
+        </w:tc>
+        <w:tc>
+          <w:tcPr>
+            <w:tcBorders>
+              <w:top w:color="000000" w:space="0" w:sz="0" w:val="nil"/>
+              <w:left w:color="000000" w:space="0" w:sz="0" w:val="nil"/>
+              <w:bottom w:color="000000" w:space="0" w:sz="0" w:val="nil"/>
+              <w:right w:color="000000" w:space="0" w:sz="0" w:val="nil"/>
+            </w:tcBorders>
+            <w:tcMar>
+              <w:top w:w="100.0" w:type="dxa"/>
+              <w:left w:w="100.0" w:type="dxa"/>
+              <w:bottom w:w="100.0" w:type="dxa"/>
+              <w:right w:w="100.0" w:type="dxa"/>
+            </w:tcMar>
+            <w:vAlign w:val="top"/>
+          </w:tcPr>
+          <w:p>
+            <w:pPr>
+              <w:rPr/>
+            </w:pPr>
+            <w:r>
+              <w:rPr>
+                <w:rtl w:val="0"/>
+              </w:rPr>
+              <w:t xml:space="preserve">A confirmar</w:t>
             </w:r>
           </w:p>
         </w:tc>
@@ -3250,35 +3284,35 @@
               <w:rPr>
                 <w:rtl w:val="0"/>
               </w:rPr>
-              <w:t xml:space="preserve">__________</w:t>
-            </w:r>
-          </w:p>
-        </w:tc>
-        <w:tc>
-          <w:tcPr>
-            <w:tcBorders>
-              <w:top w:color="000000" w:space="0" w:sz="0" w:val="nil"/>
-              <w:left w:color="000000" w:space="0" w:sz="0" w:val="nil"/>
-              <w:bottom w:color="000000" w:space="0" w:sz="0" w:val="nil"/>
-              <w:right w:color="000000" w:space="0" w:sz="0" w:val="nil"/>
-            </w:tcBorders>
-            <w:tcMar>
-              <w:top w:w="100.0" w:type="dxa"/>
-              <w:left w:w="100.0" w:type="dxa"/>
-              <w:bottom w:w="100.0" w:type="dxa"/>
-              <w:right w:w="100.0" w:type="dxa"/>
-            </w:tcMar>
-            <w:vAlign w:val="top"/>
-          </w:tcPr>
-          <w:p>
-            <w:pPr>
-              <w:rPr/>
-            </w:pPr>
-            <w:r>
-              <w:rPr>
-                <w:rtl w:val="0"/>
-              </w:rPr>
-              <w:t xml:space="preserve">__________</w:t>
+              <w:t xml:space="preserve">03/12/2026</w:t>
+            </w:r>
+          </w:p>
+        </w:tc>
+        <w:tc>
+          <w:tcPr>
+            <w:tcBorders>
+              <w:top w:color="000000" w:space="0" w:sz="0" w:val="nil"/>
+              <w:left w:color="000000" w:space="0" w:sz="0" w:val="nil"/>
+              <w:bottom w:color="000000" w:space="0" w:sz="0" w:val="nil"/>
+              <w:right w:color="000000" w:space="0" w:sz="0" w:val="nil"/>
+            </w:tcBorders>
+            <w:tcMar>
+              <w:top w:w="100.0" w:type="dxa"/>
+              <w:left w:w="100.0" w:type="dxa"/>
+              <w:bottom w:w="100.0" w:type="dxa"/>
+              <w:right w:w="100.0" w:type="dxa"/>
+            </w:tcMar>
+            <w:vAlign w:val="top"/>
+          </w:tcPr>
+          <w:p>
+            <w:pPr>
+              <w:rPr/>
+            </w:pPr>
+            <w:r>
+              <w:rPr>
+                <w:rtl w:val="0"/>
+              </w:rPr>
+              <w:t xml:space="preserve">A confirmar</w:t>
             </w:r>
           </w:p>
         </w:tc>
@@ -3341,35 +3375,35 @@
               <w:rPr>
                 <w:rtl w:val="0"/>
               </w:rPr>
-              <w:t xml:space="preserve">__________</w:t>
-            </w:r>
-          </w:p>
-        </w:tc>
-        <w:tc>
-          <w:tcPr>
-            <w:tcBorders>
-              <w:top w:color="000000" w:space="0" w:sz="0" w:val="nil"/>
-              <w:left w:color="000000" w:space="0" w:sz="0" w:val="nil"/>
-              <w:bottom w:color="000000" w:space="0" w:sz="0" w:val="nil"/>
-              <w:right w:color="000000" w:space="0" w:sz="0" w:val="nil"/>
-            </w:tcBorders>
-            <w:tcMar>
-              <w:top w:w="100.0" w:type="dxa"/>
-              <w:left w:w="100.0" w:type="dxa"/>
-              <w:bottom w:w="100.0" w:type="dxa"/>
-              <w:right w:w="100.0" w:type="dxa"/>
-            </w:tcMar>
-            <w:vAlign w:val="top"/>
-          </w:tcPr>
-          <w:p>
-            <w:pPr>
-              <w:rPr/>
-            </w:pPr>
-            <w:r>
-              <w:rPr>
-                <w:rtl w:val="0"/>
-              </w:rPr>
-              <w:t xml:space="preserve">__________</w:t>
+              <w:t xml:space="preserve">03/12/2026</w:t>
+            </w:r>
+          </w:p>
+        </w:tc>
+        <w:tc>
+          <w:tcPr>
+            <w:tcBorders>
+              <w:top w:color="000000" w:space="0" w:sz="0" w:val="nil"/>
+              <w:left w:color="000000" w:space="0" w:sz="0" w:val="nil"/>
+              <w:bottom w:color="000000" w:space="0" w:sz="0" w:val="nil"/>
+              <w:right w:color="000000" w:space="0" w:sz="0" w:val="nil"/>
+            </w:tcBorders>
+            <w:tcMar>
+              <w:top w:w="100.0" w:type="dxa"/>
+              <w:left w:w="100.0" w:type="dxa"/>
+              <w:bottom w:w="100.0" w:type="dxa"/>
+              <w:right w:w="100.0" w:type="dxa"/>
+            </w:tcMar>
+            <w:vAlign w:val="top"/>
+          </w:tcPr>
+          <w:p>
+            <w:pPr>
+              <w:rPr/>
+            </w:pPr>
+            <w:r>
+              <w:rPr>
+                <w:rtl w:val="0"/>
+              </w:rPr>
+              <w:t xml:space="preserve">A confirmar</w:t>
             </w:r>
           </w:p>
         </w:tc>
@@ -3432,35 +3466,35 @@
               <w:rPr>
                 <w:rtl w:val="0"/>
               </w:rPr>
-              <w:t xml:space="preserve">__________</w:t>
-            </w:r>
-          </w:p>
-        </w:tc>
-        <w:tc>
-          <w:tcPr>
-            <w:tcBorders>
-              <w:top w:color="000000" w:space="0" w:sz="0" w:val="nil"/>
-              <w:left w:color="000000" w:space="0" w:sz="0" w:val="nil"/>
-              <w:bottom w:color="000000" w:space="0" w:sz="0" w:val="nil"/>
-              <w:right w:color="000000" w:space="0" w:sz="0" w:val="nil"/>
-            </w:tcBorders>
-            <w:tcMar>
-              <w:top w:w="100.0" w:type="dxa"/>
-              <w:left w:w="100.0" w:type="dxa"/>
-              <w:bottom w:w="100.0" w:type="dxa"/>
-              <w:right w:w="100.0" w:type="dxa"/>
-            </w:tcMar>
-            <w:vAlign w:val="top"/>
-          </w:tcPr>
-          <w:p>
-            <w:pPr>
-              <w:rPr/>
-            </w:pPr>
-            <w:r>
-              <w:rPr>
-                <w:rtl w:val="0"/>
-              </w:rPr>
-              <w:t xml:space="preserve">__________</w:t>
+              <w:t xml:space="preserve">03/12/2026</w:t>
+            </w:r>
+          </w:p>
+        </w:tc>
+        <w:tc>
+          <w:tcPr>
+            <w:tcBorders>
+              <w:top w:color="000000" w:space="0" w:sz="0" w:val="nil"/>
+              <w:left w:color="000000" w:space="0" w:sz="0" w:val="nil"/>
+              <w:bottom w:color="000000" w:space="0" w:sz="0" w:val="nil"/>
+              <w:right w:color="000000" w:space="0" w:sz="0" w:val="nil"/>
+            </w:tcBorders>
+            <w:tcMar>
+              <w:top w:w="100.0" w:type="dxa"/>
+              <w:left w:w="100.0" w:type="dxa"/>
+              <w:bottom w:w="100.0" w:type="dxa"/>
+              <w:right w:w="100.0" w:type="dxa"/>
+            </w:tcMar>
+            <w:vAlign w:val="top"/>
+          </w:tcPr>
+          <w:p>
+            <w:pPr>
+              <w:rPr/>
+            </w:pPr>
+            <w:r>
+              <w:rPr>
+                <w:rtl w:val="0"/>
+              </w:rPr>
+              <w:t xml:space="preserve">A confirmar</w:t>
             </w:r>
           </w:p>
         </w:tc>
@@ -3523,35 +3557,35 @@
               <w:rPr>
                 <w:rtl w:val="0"/>
               </w:rPr>
-              <w:t xml:space="preserve">__________</w:t>
-            </w:r>
-          </w:p>
-        </w:tc>
-        <w:tc>
-          <w:tcPr>
-            <w:tcBorders>
-              <w:top w:color="000000" w:space="0" w:sz="0" w:val="nil"/>
-              <w:left w:color="000000" w:space="0" w:sz="0" w:val="nil"/>
-              <w:bottom w:color="000000" w:space="0" w:sz="0" w:val="nil"/>
-              <w:right w:color="000000" w:space="0" w:sz="0" w:val="nil"/>
-            </w:tcBorders>
-            <w:tcMar>
-              <w:top w:w="100.0" w:type="dxa"/>
-              <w:left w:w="100.0" w:type="dxa"/>
-              <w:bottom w:w="100.0" w:type="dxa"/>
-              <w:right w:w="100.0" w:type="dxa"/>
-            </w:tcMar>
-            <w:vAlign w:val="top"/>
-          </w:tcPr>
-          <w:p>
-            <w:pPr>
-              <w:rPr/>
-            </w:pPr>
-            <w:r>
-              <w:rPr>
-                <w:rtl w:val="0"/>
-              </w:rPr>
-              <w:t xml:space="preserve">__________</w:t>
+              <w:t xml:space="preserve">03/12/2026</w:t>
+            </w:r>
+          </w:p>
+        </w:tc>
+        <w:tc>
+          <w:tcPr>
+            <w:tcBorders>
+              <w:top w:color="000000" w:space="0" w:sz="0" w:val="nil"/>
+              <w:left w:color="000000" w:space="0" w:sz="0" w:val="nil"/>
+              <w:bottom w:color="000000" w:space="0" w:sz="0" w:val="nil"/>
+              <w:right w:color="000000" w:space="0" w:sz="0" w:val="nil"/>
+            </w:tcBorders>
+            <w:tcMar>
+              <w:top w:w="100.0" w:type="dxa"/>
+              <w:left w:w="100.0" w:type="dxa"/>
+              <w:bottom w:w="100.0" w:type="dxa"/>
+              <w:right w:w="100.0" w:type="dxa"/>
+            </w:tcMar>
+            <w:vAlign w:val="top"/>
+          </w:tcPr>
+          <w:p>
+            <w:pPr>
+              <w:rPr/>
+            </w:pPr>
+            <w:r>
+              <w:rPr>
+                <w:rtl w:val="0"/>
+              </w:rPr>
+              <w:t xml:space="preserve">A confirmar</w:t>
             </w:r>
           </w:p>
         </w:tc>
@@ -3614,35 +3648,35 @@
               <w:rPr>
                 <w:rtl w:val="0"/>
               </w:rPr>
-              <w:t xml:space="preserve">__________</w:t>
-            </w:r>
-          </w:p>
-        </w:tc>
-        <w:tc>
-          <w:tcPr>
-            <w:tcBorders>
-              <w:top w:color="000000" w:space="0" w:sz="0" w:val="nil"/>
-              <w:left w:color="000000" w:space="0" w:sz="0" w:val="nil"/>
-              <w:bottom w:color="000000" w:space="0" w:sz="0" w:val="nil"/>
-              <w:right w:color="000000" w:space="0" w:sz="0" w:val="nil"/>
-            </w:tcBorders>
-            <w:tcMar>
-              <w:top w:w="100.0" w:type="dxa"/>
-              <w:left w:w="100.0" w:type="dxa"/>
-              <w:bottom w:w="100.0" w:type="dxa"/>
-              <w:right w:w="100.0" w:type="dxa"/>
-            </w:tcMar>
-            <w:vAlign w:val="top"/>
-          </w:tcPr>
-          <w:p>
-            <w:pPr>
-              <w:rPr/>
-            </w:pPr>
-            <w:r>
-              <w:rPr>
-                <w:rtl w:val="0"/>
-              </w:rPr>
-              <w:t xml:space="preserve">__________</w:t>
+              <w:t xml:space="preserve">03/12/2026</w:t>
+            </w:r>
+          </w:p>
+        </w:tc>
+        <w:tc>
+          <w:tcPr>
+            <w:tcBorders>
+              <w:top w:color="000000" w:space="0" w:sz="0" w:val="nil"/>
+              <w:left w:color="000000" w:space="0" w:sz="0" w:val="nil"/>
+              <w:bottom w:color="000000" w:space="0" w:sz="0" w:val="nil"/>
+              <w:right w:color="000000" w:space="0" w:sz="0" w:val="nil"/>
+            </w:tcBorders>
+            <w:tcMar>
+              <w:top w:w="100.0" w:type="dxa"/>
+              <w:left w:w="100.0" w:type="dxa"/>
+              <w:bottom w:w="100.0" w:type="dxa"/>
+              <w:right w:w="100.0" w:type="dxa"/>
+            </w:tcMar>
+            <w:vAlign w:val="top"/>
+          </w:tcPr>
+          <w:p>
+            <w:pPr>
+              <w:rPr/>
+            </w:pPr>
+            <w:r>
+              <w:rPr>
+                <w:rtl w:val="0"/>
+              </w:rPr>
+              <w:t xml:space="preserve">A confirmar</w:t>
             </w:r>
           </w:p>
         </w:tc>
@@ -3705,35 +3739,35 @@
               <w:rPr>
                 <w:rtl w:val="0"/>
               </w:rPr>
-              <w:t xml:space="preserve">__________</w:t>
-            </w:r>
-          </w:p>
-        </w:tc>
-        <w:tc>
-          <w:tcPr>
-            <w:tcBorders>
-              <w:top w:color="000000" w:space="0" w:sz="0" w:val="nil"/>
-              <w:left w:color="000000" w:space="0" w:sz="0" w:val="nil"/>
-              <w:bottom w:color="000000" w:space="0" w:sz="0" w:val="nil"/>
-              <w:right w:color="000000" w:space="0" w:sz="0" w:val="nil"/>
-            </w:tcBorders>
-            <w:tcMar>
-              <w:top w:w="100.0" w:type="dxa"/>
-              <w:left w:w="100.0" w:type="dxa"/>
-              <w:bottom w:w="100.0" w:type="dxa"/>
-              <w:right w:w="100.0" w:type="dxa"/>
-            </w:tcMar>
-            <w:vAlign w:val="top"/>
-          </w:tcPr>
-          <w:p>
-            <w:pPr>
-              <w:rPr/>
-            </w:pPr>
-            <w:r>
-              <w:rPr>
-                <w:rtl w:val="0"/>
-              </w:rPr>
-              <w:t xml:space="preserve">__________</w:t>
+              <w:t xml:space="preserve">03/12/2026</w:t>
+            </w:r>
+          </w:p>
+        </w:tc>
+        <w:tc>
+          <w:tcPr>
+            <w:tcBorders>
+              <w:top w:color="000000" w:space="0" w:sz="0" w:val="nil"/>
+              <w:left w:color="000000" w:space="0" w:sz="0" w:val="nil"/>
+              <w:bottom w:color="000000" w:space="0" w:sz="0" w:val="nil"/>
+              <w:right w:color="000000" w:space="0" w:sz="0" w:val="nil"/>
+            </w:tcBorders>
+            <w:tcMar>
+              <w:top w:w="100.0" w:type="dxa"/>
+              <w:left w:w="100.0" w:type="dxa"/>
+              <w:bottom w:w="100.0" w:type="dxa"/>
+              <w:right w:w="100.0" w:type="dxa"/>
+            </w:tcMar>
+            <w:vAlign w:val="top"/>
+          </w:tcPr>
+          <w:p>
+            <w:pPr>
+              <w:rPr/>
+            </w:pPr>
+            <w:r>
+              <w:rPr>
+                <w:rtl w:val="0"/>
+              </w:rPr>
+              <w:t xml:space="preserve">A confirmar</w:t>
             </w:r>
           </w:p>
         </w:tc>
@@ -3796,35 +3830,35 @@
               <w:rPr>
                 <w:rtl w:val="0"/>
               </w:rPr>
-              <w:t xml:space="preserve">__________</w:t>
-            </w:r>
-          </w:p>
-        </w:tc>
-        <w:tc>
-          <w:tcPr>
-            <w:tcBorders>
-              <w:top w:color="000000" w:space="0" w:sz="0" w:val="nil"/>
-              <w:left w:color="000000" w:space="0" w:sz="0" w:val="nil"/>
-              <w:bottom w:color="000000" w:space="0" w:sz="0" w:val="nil"/>
-              <w:right w:color="000000" w:space="0" w:sz="0" w:val="nil"/>
-            </w:tcBorders>
-            <w:tcMar>
-              <w:top w:w="100.0" w:type="dxa"/>
-              <w:left w:w="100.0" w:type="dxa"/>
-              <w:bottom w:w="100.0" w:type="dxa"/>
-              <w:right w:w="100.0" w:type="dxa"/>
-            </w:tcMar>
-            <w:vAlign w:val="top"/>
-          </w:tcPr>
-          <w:p>
-            <w:pPr>
-              <w:rPr/>
-            </w:pPr>
-            <w:r>
-              <w:rPr>
-                <w:rtl w:val="0"/>
-              </w:rPr>
-              <w:t xml:space="preserve">__________</w:t>
+              <w:t xml:space="preserve">03/12/2026</w:t>
+            </w:r>
+          </w:p>
+        </w:tc>
+        <w:tc>
+          <w:tcPr>
+            <w:tcBorders>
+              <w:top w:color="000000" w:space="0" w:sz="0" w:val="nil"/>
+              <w:left w:color="000000" w:space="0" w:sz="0" w:val="nil"/>
+              <w:bottom w:color="000000" w:space="0" w:sz="0" w:val="nil"/>
+              <w:right w:color="000000" w:space="0" w:sz="0" w:val="nil"/>
+            </w:tcBorders>
+            <w:tcMar>
+              <w:top w:w="100.0" w:type="dxa"/>
+              <w:left w:w="100.0" w:type="dxa"/>
+              <w:bottom w:w="100.0" w:type="dxa"/>
+              <w:right w:w="100.0" w:type="dxa"/>
+            </w:tcMar>
+            <w:vAlign w:val="top"/>
+          </w:tcPr>
+          <w:p>
+            <w:pPr>
+              <w:rPr/>
+            </w:pPr>
+            <w:r>
+              <w:rPr>
+                <w:rtl w:val="0"/>
+              </w:rPr>
+              <w:t xml:space="preserve">A confirmar</w:t>
             </w:r>
           </w:p>
         </w:tc>
@@ -3887,35 +3921,35 @@
               <w:rPr>
                 <w:rtl w:val="0"/>
               </w:rPr>
-              <w:t xml:space="preserve">__________</w:t>
-            </w:r>
-          </w:p>
-        </w:tc>
-        <w:tc>
-          <w:tcPr>
-            <w:tcBorders>
-              <w:top w:color="000000" w:space="0" w:sz="0" w:val="nil"/>
-              <w:left w:color="000000" w:space="0" w:sz="0" w:val="nil"/>
-              <w:bottom w:color="000000" w:space="0" w:sz="0" w:val="nil"/>
-              <w:right w:color="000000" w:space="0" w:sz="0" w:val="nil"/>
-            </w:tcBorders>
-            <w:tcMar>
-              <w:top w:w="100.0" w:type="dxa"/>
-              <w:left w:w="100.0" w:type="dxa"/>
-              <w:bottom w:w="100.0" w:type="dxa"/>
-              <w:right w:w="100.0" w:type="dxa"/>
-            </w:tcMar>
-            <w:vAlign w:val="top"/>
-          </w:tcPr>
-          <w:p>
-            <w:pPr>
-              <w:rPr/>
-            </w:pPr>
-            <w:r>
-              <w:rPr>
-                <w:rtl w:val="0"/>
-              </w:rPr>
-              <w:t xml:space="preserve">__________</w:t>
+              <w:t xml:space="preserve">03/12/2026</w:t>
+            </w:r>
+          </w:p>
+        </w:tc>
+        <w:tc>
+          <w:tcPr>
+            <w:tcBorders>
+              <w:top w:color="000000" w:space="0" w:sz="0" w:val="nil"/>
+              <w:left w:color="000000" w:space="0" w:sz="0" w:val="nil"/>
+              <w:bottom w:color="000000" w:space="0" w:sz="0" w:val="nil"/>
+              <w:right w:color="000000" w:space="0" w:sz="0" w:val="nil"/>
+            </w:tcBorders>
+            <w:tcMar>
+              <w:top w:w="100.0" w:type="dxa"/>
+              <w:left w:w="100.0" w:type="dxa"/>
+              <w:bottom w:w="100.0" w:type="dxa"/>
+              <w:right w:w="100.0" w:type="dxa"/>
+            </w:tcMar>
+            <w:vAlign w:val="top"/>
+          </w:tcPr>
+          <w:p>
+            <w:pPr>
+              <w:rPr/>
+            </w:pPr>
+            <w:r>
+              <w:rPr>
+                <w:rtl w:val="0"/>
+              </w:rPr>
+              <w:t xml:space="preserve">A confirmar</w:t>
             </w:r>
           </w:p>
         </w:tc>
@@ -3978,35 +4012,35 @@
               <w:rPr>
                 <w:rtl w:val="0"/>
               </w:rPr>
-              <w:t xml:space="preserve">__________</w:t>
-            </w:r>
-          </w:p>
-        </w:tc>
-        <w:tc>
-          <w:tcPr>
-            <w:tcBorders>
-              <w:top w:color="000000" w:space="0" w:sz="0" w:val="nil"/>
-              <w:left w:color="000000" w:space="0" w:sz="0" w:val="nil"/>
-              <w:bottom w:color="000000" w:space="0" w:sz="0" w:val="nil"/>
-              <w:right w:color="000000" w:space="0" w:sz="0" w:val="nil"/>
-            </w:tcBorders>
-            <w:tcMar>
-              <w:top w:w="100.0" w:type="dxa"/>
-              <w:left w:w="100.0" w:type="dxa"/>
-              <w:bottom w:w="100.0" w:type="dxa"/>
-              <w:right w:w="100.0" w:type="dxa"/>
-            </w:tcMar>
-            <w:vAlign w:val="top"/>
-          </w:tcPr>
-          <w:p>
-            <w:pPr>
-              <w:rPr/>
-            </w:pPr>
-            <w:r>
-              <w:rPr>
-                <w:rtl w:val="0"/>
-              </w:rPr>
-              <w:t xml:space="preserve">__________</w:t>
+              <w:t xml:space="preserve">04/12/2026</w:t>
+            </w:r>
+          </w:p>
+        </w:tc>
+        <w:tc>
+          <w:tcPr>
+            <w:tcBorders>
+              <w:top w:color="000000" w:space="0" w:sz="0" w:val="nil"/>
+              <w:left w:color="000000" w:space="0" w:sz="0" w:val="nil"/>
+              <w:bottom w:color="000000" w:space="0" w:sz="0" w:val="nil"/>
+              <w:right w:color="000000" w:space="0" w:sz="0" w:val="nil"/>
+            </w:tcBorders>
+            <w:tcMar>
+              <w:top w:w="100.0" w:type="dxa"/>
+              <w:left w:w="100.0" w:type="dxa"/>
+              <w:bottom w:w="100.0" w:type="dxa"/>
+              <w:right w:w="100.0" w:type="dxa"/>
+            </w:tcMar>
+            <w:vAlign w:val="top"/>
+          </w:tcPr>
+          <w:p>
+            <w:pPr>
+              <w:rPr/>
+            </w:pPr>
+            <w:r>
+              <w:rPr>
+                <w:rtl w:val="0"/>
+              </w:rPr>
+              <w:t xml:space="preserve">A confirmar</w:t>
             </w:r>
           </w:p>
         </w:tc>
@@ -4069,35 +4103,35 @@
               <w:rPr>
                 <w:rtl w:val="0"/>
               </w:rPr>
-              <w:t xml:space="preserve">__________</w:t>
-            </w:r>
-          </w:p>
-        </w:tc>
-        <w:tc>
-          <w:tcPr>
-            <w:tcBorders>
-              <w:top w:color="000000" w:space="0" w:sz="0" w:val="nil"/>
-              <w:left w:color="000000" w:space="0" w:sz="0" w:val="nil"/>
-              <w:bottom w:color="000000" w:space="0" w:sz="0" w:val="nil"/>
-              <w:right w:color="000000" w:space="0" w:sz="0" w:val="nil"/>
-            </w:tcBorders>
-            <w:tcMar>
-              <w:top w:w="100.0" w:type="dxa"/>
-              <w:left w:w="100.0" w:type="dxa"/>
-              <w:bottom w:w="100.0" w:type="dxa"/>
-              <w:right w:w="100.0" w:type="dxa"/>
-            </w:tcMar>
-            <w:vAlign w:val="top"/>
-          </w:tcPr>
-          <w:p>
-            <w:pPr>
-              <w:rPr/>
-            </w:pPr>
-            <w:r>
-              <w:rPr>
-                <w:rtl w:val="0"/>
-              </w:rPr>
-              <w:t xml:space="preserve">__________</w:t>
+              <w:t xml:space="preserve">04/12/2026</w:t>
+            </w:r>
+          </w:p>
+        </w:tc>
+        <w:tc>
+          <w:tcPr>
+            <w:tcBorders>
+              <w:top w:color="000000" w:space="0" w:sz="0" w:val="nil"/>
+              <w:left w:color="000000" w:space="0" w:sz="0" w:val="nil"/>
+              <w:bottom w:color="000000" w:space="0" w:sz="0" w:val="nil"/>
+              <w:right w:color="000000" w:space="0" w:sz="0" w:val="nil"/>
+            </w:tcBorders>
+            <w:tcMar>
+              <w:top w:w="100.0" w:type="dxa"/>
+              <w:left w:w="100.0" w:type="dxa"/>
+              <w:bottom w:w="100.0" w:type="dxa"/>
+              <w:right w:w="100.0" w:type="dxa"/>
+            </w:tcMar>
+            <w:vAlign w:val="top"/>
+          </w:tcPr>
+          <w:p>
+            <w:pPr>
+              <w:rPr/>
+            </w:pPr>
+            <w:r>
+              <w:rPr>
+                <w:rtl w:val="0"/>
+              </w:rPr>
+              <w:t xml:space="preserve">A confirmar</w:t>
             </w:r>
           </w:p>
         </w:tc>
@@ -4160,35 +4194,35 @@
               <w:rPr>
                 <w:rtl w:val="0"/>
               </w:rPr>
-              <w:t xml:space="preserve">__________</w:t>
-            </w:r>
-          </w:p>
-        </w:tc>
-        <w:tc>
-          <w:tcPr>
-            <w:tcBorders>
-              <w:top w:color="000000" w:space="0" w:sz="0" w:val="nil"/>
-              <w:left w:color="000000" w:space="0" w:sz="0" w:val="nil"/>
-              <w:bottom w:color="000000" w:space="0" w:sz="0" w:val="nil"/>
-              <w:right w:color="000000" w:space="0" w:sz="0" w:val="nil"/>
-            </w:tcBorders>
-            <w:tcMar>
-              <w:top w:w="100.0" w:type="dxa"/>
-              <w:left w:w="100.0" w:type="dxa"/>
-              <w:bottom w:w="100.0" w:type="dxa"/>
-              <w:right w:w="100.0" w:type="dxa"/>
-            </w:tcMar>
-            <w:vAlign w:val="top"/>
-          </w:tcPr>
-          <w:p>
-            <w:pPr>
-              <w:rPr/>
-            </w:pPr>
-            <w:r>
-              <w:rPr>
-                <w:rtl w:val="0"/>
-              </w:rPr>
-              <w:t xml:space="preserve">__________</w:t>
+              <w:t xml:space="preserve">04/12/2026</w:t>
+            </w:r>
+          </w:p>
+        </w:tc>
+        <w:tc>
+          <w:tcPr>
+            <w:tcBorders>
+              <w:top w:color="000000" w:space="0" w:sz="0" w:val="nil"/>
+              <w:left w:color="000000" w:space="0" w:sz="0" w:val="nil"/>
+              <w:bottom w:color="000000" w:space="0" w:sz="0" w:val="nil"/>
+              <w:right w:color="000000" w:space="0" w:sz="0" w:val="nil"/>
+            </w:tcBorders>
+            <w:tcMar>
+              <w:top w:w="100.0" w:type="dxa"/>
+              <w:left w:w="100.0" w:type="dxa"/>
+              <w:bottom w:w="100.0" w:type="dxa"/>
+              <w:right w:w="100.0" w:type="dxa"/>
+            </w:tcMar>
+            <w:vAlign w:val="top"/>
+          </w:tcPr>
+          <w:p>
+            <w:pPr>
+              <w:rPr/>
+            </w:pPr>
+            <w:r>
+              <w:rPr>
+                <w:rtl w:val="0"/>
+              </w:rPr>
+              <w:t xml:space="preserve">A confirmar</w:t>
             </w:r>
           </w:p>
         </w:tc>
@@ -4251,35 +4285,35 @@
               <w:rPr>
                 <w:rtl w:val="0"/>
               </w:rPr>
-              <w:t xml:space="preserve">__________</w:t>
-            </w:r>
-          </w:p>
-        </w:tc>
-        <w:tc>
-          <w:tcPr>
-            <w:tcBorders>
-              <w:top w:color="000000" w:space="0" w:sz="0" w:val="nil"/>
-              <w:left w:color="000000" w:space="0" w:sz="0" w:val="nil"/>
-              <w:bottom w:color="000000" w:space="0" w:sz="0" w:val="nil"/>
-              <w:right w:color="000000" w:space="0" w:sz="0" w:val="nil"/>
-            </w:tcBorders>
-            <w:tcMar>
-              <w:top w:w="100.0" w:type="dxa"/>
-              <w:left w:w="100.0" w:type="dxa"/>
-              <w:bottom w:w="100.0" w:type="dxa"/>
-              <w:right w:w="100.0" w:type="dxa"/>
-            </w:tcMar>
-            <w:vAlign w:val="top"/>
-          </w:tcPr>
-          <w:p>
-            <w:pPr>
-              <w:rPr/>
-            </w:pPr>
-            <w:r>
-              <w:rPr>
-                <w:rtl w:val="0"/>
-              </w:rPr>
-              <w:t xml:space="preserve">__________</w:t>
+              <w:t xml:space="preserve">04/12/2026</w:t>
+            </w:r>
+          </w:p>
+        </w:tc>
+        <w:tc>
+          <w:tcPr>
+            <w:tcBorders>
+              <w:top w:color="000000" w:space="0" w:sz="0" w:val="nil"/>
+              <w:left w:color="000000" w:space="0" w:sz="0" w:val="nil"/>
+              <w:bottom w:color="000000" w:space="0" w:sz="0" w:val="nil"/>
+              <w:right w:color="000000" w:space="0" w:sz="0" w:val="nil"/>
+            </w:tcBorders>
+            <w:tcMar>
+              <w:top w:w="100.0" w:type="dxa"/>
+              <w:left w:w="100.0" w:type="dxa"/>
+              <w:bottom w:w="100.0" w:type="dxa"/>
+              <w:right w:w="100.0" w:type="dxa"/>
+            </w:tcMar>
+            <w:vAlign w:val="top"/>
+          </w:tcPr>
+          <w:p>
+            <w:pPr>
+              <w:rPr/>
+            </w:pPr>
+            <w:r>
+              <w:rPr>
+                <w:rtl w:val="0"/>
+              </w:rPr>
+              <w:t xml:space="preserve">A confirmar</w:t>
             </w:r>
           </w:p>
         </w:tc>
@@ -4342,35 +4376,35 @@
               <w:rPr>
                 <w:rtl w:val="0"/>
               </w:rPr>
-              <w:t xml:space="preserve">__________</w:t>
-            </w:r>
-          </w:p>
-        </w:tc>
-        <w:tc>
-          <w:tcPr>
-            <w:tcBorders>
-              <w:top w:color="000000" w:space="0" w:sz="0" w:val="nil"/>
-              <w:left w:color="000000" w:space="0" w:sz="0" w:val="nil"/>
-              <w:bottom w:color="000000" w:space="0" w:sz="0" w:val="nil"/>
-              <w:right w:color="000000" w:space="0" w:sz="0" w:val="nil"/>
-            </w:tcBorders>
-            <w:tcMar>
-              <w:top w:w="100.0" w:type="dxa"/>
-              <w:left w:w="100.0" w:type="dxa"/>
-              <w:bottom w:w="100.0" w:type="dxa"/>
-              <w:right w:w="100.0" w:type="dxa"/>
-            </w:tcMar>
-            <w:vAlign w:val="top"/>
-          </w:tcPr>
-          <w:p>
-            <w:pPr>
-              <w:rPr/>
-            </w:pPr>
-            <w:r>
-              <w:rPr>
-                <w:rtl w:val="0"/>
-              </w:rPr>
-              <w:t xml:space="preserve">__________</w:t>
+              <w:t xml:space="preserve">04/12/2026</w:t>
+            </w:r>
+          </w:p>
+        </w:tc>
+        <w:tc>
+          <w:tcPr>
+            <w:tcBorders>
+              <w:top w:color="000000" w:space="0" w:sz="0" w:val="nil"/>
+              <w:left w:color="000000" w:space="0" w:sz="0" w:val="nil"/>
+              <w:bottom w:color="000000" w:space="0" w:sz="0" w:val="nil"/>
+              <w:right w:color="000000" w:space="0" w:sz="0" w:val="nil"/>
+            </w:tcBorders>
+            <w:tcMar>
+              <w:top w:w="100.0" w:type="dxa"/>
+              <w:left w:w="100.0" w:type="dxa"/>
+              <w:bottom w:w="100.0" w:type="dxa"/>
+              <w:right w:w="100.0" w:type="dxa"/>
+            </w:tcMar>
+            <w:vAlign w:val="top"/>
+          </w:tcPr>
+          <w:p>
+            <w:pPr>
+              <w:rPr/>
+            </w:pPr>
+            <w:r>
+              <w:rPr>
+                <w:rtl w:val="0"/>
+              </w:rPr>
+              <w:t xml:space="preserve">A confirmar</w:t>
             </w:r>
           </w:p>
         </w:tc>
@@ -4433,35 +4467,35 @@
               <w:rPr>
                 <w:rtl w:val="0"/>
               </w:rPr>
-              <w:t xml:space="preserve">__________</w:t>
-            </w:r>
-          </w:p>
-        </w:tc>
-        <w:tc>
-          <w:tcPr>
-            <w:tcBorders>
-              <w:top w:color="000000" w:space="0" w:sz="0" w:val="nil"/>
-              <w:left w:color="000000" w:space="0" w:sz="0" w:val="nil"/>
-              <w:bottom w:color="000000" w:space="0" w:sz="0" w:val="nil"/>
-              <w:right w:color="000000" w:space="0" w:sz="0" w:val="nil"/>
-            </w:tcBorders>
-            <w:tcMar>
-              <w:top w:w="100.0" w:type="dxa"/>
-              <w:left w:w="100.0" w:type="dxa"/>
-              <w:bottom w:w="100.0" w:type="dxa"/>
-              <w:right w:w="100.0" w:type="dxa"/>
-            </w:tcMar>
-            <w:vAlign w:val="top"/>
-          </w:tcPr>
-          <w:p>
-            <w:pPr>
-              <w:rPr/>
-            </w:pPr>
-            <w:r>
-              <w:rPr>
-                <w:rtl w:val="0"/>
-              </w:rPr>
-              <w:t xml:space="preserve">__________</w:t>
+              <w:t xml:space="preserve">04/12/2026</w:t>
+            </w:r>
+          </w:p>
+        </w:tc>
+        <w:tc>
+          <w:tcPr>
+            <w:tcBorders>
+              <w:top w:color="000000" w:space="0" w:sz="0" w:val="nil"/>
+              <w:left w:color="000000" w:space="0" w:sz="0" w:val="nil"/>
+              <w:bottom w:color="000000" w:space="0" w:sz="0" w:val="nil"/>
+              <w:right w:color="000000" w:space="0" w:sz="0" w:val="nil"/>
+            </w:tcBorders>
+            <w:tcMar>
+              <w:top w:w="100.0" w:type="dxa"/>
+              <w:left w:w="100.0" w:type="dxa"/>
+              <w:bottom w:w="100.0" w:type="dxa"/>
+              <w:right w:w="100.0" w:type="dxa"/>
+            </w:tcMar>
+            <w:vAlign w:val="top"/>
+          </w:tcPr>
+          <w:p>
+            <w:pPr>
+              <w:rPr/>
+            </w:pPr>
+            <w:r>
+              <w:rPr>
+                <w:rtl w:val="0"/>
+              </w:rPr>
+              <w:t xml:space="preserve">A confirmar</w:t>
             </w:r>
           </w:p>
         </w:tc>
@@ -4524,35 +4558,35 @@
               <w:rPr>
                 <w:rtl w:val="0"/>
               </w:rPr>
-              <w:t xml:space="preserve">__________</w:t>
-            </w:r>
-          </w:p>
-        </w:tc>
-        <w:tc>
-          <w:tcPr>
-            <w:tcBorders>
-              <w:top w:color="000000" w:space="0" w:sz="0" w:val="nil"/>
-              <w:left w:color="000000" w:space="0" w:sz="0" w:val="nil"/>
-              <w:bottom w:color="000000" w:space="0" w:sz="0" w:val="nil"/>
-              <w:right w:color="000000" w:space="0" w:sz="0" w:val="nil"/>
-            </w:tcBorders>
-            <w:tcMar>
-              <w:top w:w="100.0" w:type="dxa"/>
-              <w:left w:w="100.0" w:type="dxa"/>
-              <w:bottom w:w="100.0" w:type="dxa"/>
-              <w:right w:w="100.0" w:type="dxa"/>
-            </w:tcMar>
-            <w:vAlign w:val="top"/>
-          </w:tcPr>
-          <w:p>
-            <w:pPr>
-              <w:rPr/>
-            </w:pPr>
-            <w:r>
-              <w:rPr>
-                <w:rtl w:val="0"/>
-              </w:rPr>
-              <w:t xml:space="preserve">__________</w:t>
+              <w:t xml:space="preserve">04/12/2026</w:t>
+            </w:r>
+          </w:p>
+        </w:tc>
+        <w:tc>
+          <w:tcPr>
+            <w:tcBorders>
+              <w:top w:color="000000" w:space="0" w:sz="0" w:val="nil"/>
+              <w:left w:color="000000" w:space="0" w:sz="0" w:val="nil"/>
+              <w:bottom w:color="000000" w:space="0" w:sz="0" w:val="nil"/>
+              <w:right w:color="000000" w:space="0" w:sz="0" w:val="nil"/>
+            </w:tcBorders>
+            <w:tcMar>
+              <w:top w:w="100.0" w:type="dxa"/>
+              <w:left w:w="100.0" w:type="dxa"/>
+              <w:bottom w:w="100.0" w:type="dxa"/>
+              <w:right w:w="100.0" w:type="dxa"/>
+            </w:tcMar>
+            <w:vAlign w:val="top"/>
+          </w:tcPr>
+          <w:p>
+            <w:pPr>
+              <w:rPr/>
+            </w:pPr>
+            <w:r>
+              <w:rPr>
+                <w:rtl w:val="0"/>
+              </w:rPr>
+              <w:t xml:space="preserve">A confirmar</w:t>
             </w:r>
           </w:p>
         </w:tc>
@@ -4649,7 +4683,7 @@
         <w:rPr>
           <w:rtl w:val="0"/>
         </w:rPr>
-        <w:t xml:space="preserve">Informações complementares, incluindo normas para submissão dos trabalhos, modelo de pôster/painel, programação definitiva e orientações aos participantes, serão divulgadas posteriormente pelos canais oficiais de comunicação do evento.</w:t>
+        <w:t xml:space="preserve">Informações complementares, incluindo modelo de pôster/painel, programação definitiva e orientações aos participantes, serão divulgadas posteriormente pelos canais oficiais de comunicação do evento.</w:t>
       </w:r>
     </w:p>
     <w:p>
@@ -4680,7 +4714,7 @@
         </w:rPr>
         <w:t xml:space="preserve">COMISSÃO ORGANIZADORA</w:t>
         <w:br w:type="textWrapping"/>
-        <w:t xml:space="preserve">Simpósio de Urgência e Emergência</w:t>
+        <w:t xml:space="preserve">1º Simpósio de Urgência e Emergência</w:t>
         <w:br w:type="textWrapping"/>
         <w:t xml:space="preserve">Subsecretaria de Atenção Hospitalar, Urgência e Emergência – SUBHUE</w:t>
         <w:br w:type="textWrapping"/>

</xml_diff>

<commit_message>
Inscrições de 06/10 a 30/11 e relógio do fim das inscrições
- Inscrições abrem em 06/10/2026 e encerram em 30/11/2026, no site,
  no edital e no banco; o formulário fecha sozinho após o prazo
- Relógio com dias, horas, minutos e segundos até o fim das
  inscrições, na página inicial e no painel da página Inscrições
- Prazos do site calculados no horário de Brasília, como no banco
- Datas do evento escritas como "3 e 4 de dezembro" nos textos
- Testes do banco cobrem a abertura e o fechamento das inscrições

Co-Authored-By: Claude Opus 5.5 <noreply@anthropic.com>
Claude-Session: https://claude.ai/code/session_01XvSnyy5x4WrQRf3DuqJm68
</commit_message>
<xml_diff>
--- a/Edital.docx
+++ b/Edital.docx
@@ -63,7 +63,7 @@
         <w:rPr>
           <w:rtl w:val="0"/>
         </w:rPr>
-        <w:t xml:space="preserve">A Secretaria Municipal de Saúde do Rio de Janeiro, por meio da Subsecretaria de Atenção Hospitalar, Urgência e Emergência – SUBHUE, realizará o 1º Simpósio de Urgência e Emergência, nos dias 03 e 04 de dezembro de 2026, com o objetivo de promover a atualização técnico-científica, a integração entre os profissionais da Rede de Urgência e Emergência e o compartilhamento de experiências e práticas voltadas à qualificação da assistência.</w:t>
+        <w:t xml:space="preserve">A Secretaria Municipal de Saúde do Rio de Janeiro, por meio da Subsecretaria de Atenção Hospitalar, Urgência e Emergência – SUBHUE, realizará o 1º Simpósio de Urgência e Emergência, nos dias 3 e 4 de dezembro de 2026, com o objetivo de promover a atualização técnico-científica, a integração entre os profissionais da Rede de Urgência e Emergência e o compartilhamento de experiências e práticas voltadas à qualificação da assistência.</w:t>
       </w:r>
     </w:p>
     <w:p>
@@ -593,7 +593,7 @@
           <w:bCs w:val="1"/>
           <w:rtl w:val="0"/>
         </w:rPr>
-        <w:t xml:space="preserve">Início das inscrições: 25/09/2026.</w:t>
+        <w:t xml:space="preserve">Período de inscrições: de 06/10/2026 até 30/11/2026.</w:t>
       </w:r>
     </w:p>
     <w:p>
@@ -1923,7 +1923,7 @@
               <w:rPr>
                 <w:rtl w:val="0"/>
               </w:rPr>
-              <w:t xml:space="preserve">25/09/2026</w:t>
+              <w:t xml:space="preserve">06/10/2026</w:t>
             </w:r>
           </w:p>
         </w:tc>
@@ -2049,7 +2049,7 @@
               <w:rPr>
                 <w:rtl w:val="0"/>
               </w:rPr>
-              <w:t xml:space="preserve">A divulgar</w:t>
+              <w:t xml:space="preserve">30/11/2026</w:t>
             </w:r>
           </w:p>
         </w:tc>
@@ -2625,7 +2625,7 @@
         <w:rPr>
           <w:rtl w:val="0"/>
         </w:rPr>
-        <w:t xml:space="preserve">O Simpósio será realizado nos dias 03 e 04 de dezembro de 2026. Os horários e os nomes dos palestrantes serão confirmados na divulgação da programação final.</w:t>
+        <w:t xml:space="preserve">O Simpósio será realizado nos dias 3 e 4 de dezembro de 2026. Os horários e os nomes dos palestrantes serão confirmados na divulgação da programação final.</w:t>
       </w:r>
     </w:p>
     <w:tbl>

</xml_diff>

<commit_message>
Envio de trabalhos até 06/11 e capa na versão de arquivo único
- Prazo de envio dos trabalhos passa de 31/10 para 06/11/2026 no site,
  no edital, no banco e no README; o formulário fecha sozinho após
  06/11 às 23h59 de Brasília
- build.py passa a embutir imagens de srcset, como a capa em WebP;
  antes a capa não aparecia em dist/index.html

Co-Authored-By: Claude Opus 5.5 <noreply@anthropic.com>
Claude-Session: https://claude.ai/code/session_01XvSnyy5x4WrQRf3DuqJm68
</commit_message>
<xml_diff>
--- a/Edital.docx
+++ b/Edital.docx
@@ -863,7 +863,7 @@
           <w:bCs w:val="1"/>
           <w:rtl w:val="0"/>
         </w:rPr>
-        <w:t xml:space="preserve">Data limite para envio: 31/10/2026.</w:t>
+        <w:t xml:space="preserve">Data limite para envio: 06/11/2026.</w:t>
       </w:r>
     </w:p>
     <w:p>
@@ -2112,7 +2112,7 @@
               <w:rPr>
                 <w:rtl w:val="0"/>
               </w:rPr>
-              <w:t xml:space="preserve">31/10/2026</w:t>
+              <w:t xml:space="preserve">06/11/2026</w:t>
             </w:r>
           </w:p>
         </w:tc>

</xml_diff>

<commit_message>
Resumo de 2.500 caracteres, título de 200 e até 8 autores
- Resumo passa a ter até 2.500 caracteres sem espaços e o título até
  200 caracteres contando os espaços, com contador próprio no formulário
- Cada trabalho pode ter até 8 autores; de cada coautor são pedidos
  nome completo, CPF e e-mail, com instituição opcional
- Apresentador escolhido numa lista com os autores preenchidos; o
  banco confere se é um dos coautores e se está inscrito
- Banco recusa CPF repetido entre autores e título acima do limite
- Edital, normas, perguntas frequentes, README e testes atualizados

Co-Authored-By: Claude Opus 5.5 <noreply@anthropic.com>
Claude-Session: https://claude.ai/code/session_01XvSnyy5x4WrQRf3DuqJm68
</commit_message>
<xml_diff>
--- a/Edital.docx
+++ b/Edital.docx
@@ -969,6 +969,22 @@
           <w:ilvl w:val="0"/>
           <w:numId w:val="2"/>
         </w:numPr>
+        <w:spacing w:after="0" w:afterAutospacing="0" w:before="0" w:beforeAutospacing="0" w:lineRule="auto"/>
+        <w:ind w:left="720" w:hanging="360"/>
+      </w:pPr>
+      <w:r>
+        <w:rPr>
+          <w:rtl w:val="0"/>
+        </w:rPr>
+        <w:t xml:space="preserve">Cada trabalho poderá ter até 8 (oito) autores, somando autores e coautores;</w:t>
+      </w:r>
+    </w:p>
+    <w:p>
+      <w:pPr>
+        <w:numPr>
+          <w:ilvl w:val="0"/>
+          <w:numId w:val="2"/>
+        </w:numPr>
         <w:spacing w:after="240" w:before="0" w:beforeAutospacing="0" w:lineRule="auto"/>
         <w:ind w:left="720" w:hanging="360"/>
       </w:pPr>
@@ -976,7 +992,7 @@
         <w:rPr>
           <w:rtl w:val="0"/>
         </w:rPr>
-        <w:t xml:space="preserve">Cada trabalho poderá ter até 10 (dez) autores e coautores.</w:t>
+        <w:t xml:space="preserve">Para cada coautor, deverão ser informados nome completo, e-mail e CPF.</w:t>
       </w:r>
     </w:p>
     <w:p>
@@ -1032,7 +1048,23 @@
         <w:rPr>
           <w:rtl w:val="0"/>
         </w:rPr>
-        <w:t xml:space="preserve">O resumo deverá conter no máximo 2.050 caracteres, sem contar os espaços. O título e os nomes dos autores não entram na contagem de caracteres;</w:t>
+        <w:t xml:space="preserve">O resumo deverá conter no máximo 2.500 caracteres, sem contar os espaços. O título e os nomes dos autores não entram na contagem de caracteres;</w:t>
+      </w:r>
+    </w:p>
+    <w:p>
+      <w:pPr>
+        <w:numPr>
+          <w:ilvl w:val="0"/>
+          <w:numId w:val="2"/>
+        </w:numPr>
+        <w:spacing w:after="0" w:afterAutospacing="0" w:before="0" w:beforeAutospacing="0" w:lineRule="auto"/>
+        <w:ind w:left="720" w:hanging="360"/>
+      </w:pPr>
+      <w:r>
+        <w:rPr>
+          <w:rtl w:val="0"/>
+        </w:rPr>
+        <w:t xml:space="preserve">O título deverá ter no máximo 200 caracteres, contando os espaços;</w:t>
       </w:r>
     </w:p>
     <w:p>

</xml_diff>